<commit_message>
Team project sync’ed with translations and QE data
</commit_message>
<xml_diff>
--- a/target/file_with_formatting.docx
+++ b/target/file_with_formatting.docx
@@ -12,7 +12,7 @@
         <w:rPr>
           <w:rtl/>
         </w:rPr>
-        <w:t xml:space="preserve">هذه كلمة </w:t>
+        <w:t xml:space="preserve">هذه كلمة بخط </w:t>
       </w:r>
       <w:r>
         <w:rPr>
@@ -20,7 +20,7 @@
           <w:bCs/>
           <w:rtl/>
         </w:rPr>
-        <w:t>جريئة</w:t>
+        <w:t>عريض</w:t>
       </w:r>
       <w:r>
         <w:rPr>

</xml_diff>